<commit_message>
feat: add general notes for orders, checkout, and printing slips, enhance table card UI
</commit_message>
<xml_diff>
--- a/templates/hoadonbep.docx
+++ b/templates/hoadonbep.docx
@@ -71,7 +71,7 @@
     <w:tbl>
       <w:tblPr>
         <w:tblStyle w:val="TableGrid"/>
-        <w:tblpPr w:leftFromText="180" w:rightFromText="180" w:vertAnchor="text" w:horzAnchor="margin" w:tblpXSpec="center" w:tblpY="262"/>
+        <w:tblpPr w:leftFromText="180" w:rightFromText="180" w:vertAnchor="text" w:horzAnchor="margin" w:tblpY="65"/>
         <w:tblW w:w="3569" w:type="dxa"/>
         <w:tblLayout w:type="fixed"/>
         <w:tblLook w:val="04A0" w:firstRow="1" w:lastRow="0" w:firstColumn="1" w:lastColumn="0" w:noHBand="0" w:noVBand="1"/>
@@ -236,7 +236,42 @@
     <w:p>
       <w:pPr>
         <w:spacing w:line="240" w:lineRule="auto"/>
-        <w:ind w:firstLineChars="1250" w:firstLine="3500"/>
+        <w:rPr>
+          <w:sz w:val="14"/>
+          <w:szCs w:val="14"/>
+        </w:rPr>
+      </w:pPr>
+      <w:r>
+        <w:rPr>
+          <w:b/>
+          <w:bCs/>
+          <w:sz w:val="14"/>
+          <w:szCs w:val="14"/>
+        </w:rPr>
+        <w:t xml:space="preserve"> </w:t>
+      </w:r>
+      <w:r>
+        <w:rPr>
+          <w:b/>
+          <w:bCs/>
+          <w:sz w:val="14"/>
+          <w:szCs w:val="14"/>
+        </w:rPr>
+        <w:t xml:space="preserve">Ghi chú tổng: </w:t>
+      </w:r>
+      <w:r>
+        <w:rPr>
+          <w:b/>
+          <w:bCs/>
+          <w:sz w:val="14"/>
+          <w:szCs w:val="14"/>
+        </w:rPr>
+        <w:t>{general_note}</w:t>
+      </w:r>
+    </w:p>
+    <w:p>
+      <w:pPr>
+        <w:spacing w:line="240" w:lineRule="auto"/>
         <w:rPr>
           <w:sz w:val="28"/>
           <w:szCs w:val="28"/>

</xml_diff>